<commit_message>
Update testing documentation with revisions
Co-Authored-By: Claude Opus 4.6 <noreply@anthropic.com>
</commit_message>
<xml_diff>
--- a/Tests for Terminology Server.docx
+++ b/Tests for Terminology Server.docx
@@ -3,11 +3,40 @@
 <w:document xmlns:wpc="http://schemas.microsoft.com/office/word/2010/wordprocessingCanvas" xmlns:cx="http://schemas.microsoft.com/office/drawing/2014/chartex" xmlns:cx1="http://schemas.microsoft.com/office/drawing/2015/9/8/chartex" xmlns:cx2="http://schemas.microsoft.com/office/drawing/2015/10/21/chartex" xmlns:cx3="http://schemas.microsoft.com/office/drawing/2016/5/9/chartex" xmlns:cx4="http://schemas.microsoft.com/office/drawing/2016/5/10/chartex" xmlns:cx5="http://schemas.microsoft.com/office/drawing/2016/5/11/chartex" xmlns:cx6="http://schemas.microsoft.com/office/drawing/2016/5/12/chartex" xmlns:cx7="http://schemas.microsoft.com/office/drawing/2016/5/13/chartex" xmlns:cx8="http://schemas.microsoft.com/office/drawing/2016/5/14/chartex" xmlns:mc="http://schemas.openxmlformats.org/markup-compatibility/2006" xmlns:aink="http://schemas.microsoft.com/office/drawing/2016/ink" xmlns:am3d="http://schemas.microsoft.com/office/drawing/2017/model3d" xmlns:o="urn:schemas-microsoft-com:office:office" xmlns:oel="http://schemas.microsoft.com/office/2019/extlst" xmlns:r="http://schemas.openxmlformats.org/officeDocument/2006/relationships" xmlns:m="http://schemas.openxmlformats.org/officeDocument/2006/math" xmlns:v="urn:schemas-microsoft-com:vml" xmlns:wp14="http://schemas.microsoft.com/office/word/2010/wordprocessingDrawing" xmlns:wp="http://schemas.openxmlformats.org/drawingml/2006/wordprocessingDrawing" xmlns:w10="urn:schemas-microsoft-com:office:word" xmlns:w="http://schemas.openxmlformats.org/wordprocessingml/2006/main" xmlns:w14="http://schemas.microsoft.com/office/word/2010/wordml" xmlns:w15="http://schemas.microsoft.com/office/word/2012/wordml" xmlns:w16cex="http://schemas.microsoft.com/office/word/2018/wordml/cex" xmlns:w16cid="http://schemas.microsoft.com/office/word/2016/wordml/cid" xmlns:w16="http://schemas.microsoft.com/office/word/2018/wordml" xmlns:w16du="http://schemas.microsoft.com/office/word/2023/wordml/word16du" xmlns:w16sdtdh="http://schemas.microsoft.com/office/word/2020/wordml/sdtdatahash" xmlns:w16sdtfl="http://schemas.microsoft.com/office/word/2024/wordml/sdtformatlock" xmlns:w16se="http://schemas.microsoft.com/office/word/2015/wordml/symex" xmlns:wpg="http://schemas.microsoft.com/office/word/2010/wordprocessingGroup" xmlns:wpi="http://schemas.microsoft.com/office/word/2010/wordprocessingInk" xmlns:wne="http://schemas.microsoft.com/office/word/2006/wordml" xmlns:wps="http://schemas.microsoft.com/office/word/2010/wordprocessingShape" mc:Ignorable="w14 w15 w16se w16cid w16 w16cex w16sdtdh w16sdtfl w16du wp14">
   <w:body>
     <w:p>
-      <w:r>
-        <w:t xml:space="preserve">Tests for Terminology Server </w:t>
-      </w:r>
-    </w:p>
-    <w:p/>
+      <w:pPr>
+        <w:jc w:val="center"/>
+      </w:pPr>
+      <w:r>
+        <w:t>Tests for Terminology Server</w:t>
+      </w:r>
+    </w:p>
+    <w:p>
+      <w:pPr>
+        <w:pStyle w:val="Heading1"/>
+      </w:pPr>
+      <w:r>
+        <w:t>Performing Tests in the IRIS Terminal</w:t>
+      </w:r>
+    </w:p>
+    <w:p/>
+    <w:p>
+      <w:r>
+        <w:t>First start up a session:</w:t>
+      </w:r>
+    </w:p>
+    <w:p>
+      <w:r>
+        <w:t xml:space="preserve">docker exec -it </w:t>
+      </w:r>
+      <w:proofErr w:type="spellStart"/>
+      <w:r>
+        <w:t>snomed</w:t>
+      </w:r>
+      <w:proofErr w:type="spellEnd"/>
+      <w:r>
+        <w:t xml:space="preserve">-iris iris session IRIS -U USER  </w:t>
+      </w:r>
+    </w:p>
     <w:p>
       <w:r>
         <w:t>C</w:t>
@@ -22,34 +51,142 @@
         <w:t xml:space="preserve">  Write ##class(SNOMED.Tools.Lookup).GetConcept("73211009")</w:t>
       </w:r>
     </w:p>
+    <w:p/>
+    <w:p>
+      <w:r>
+        <w:t>{"ConceptId":"73211009","Active":1,"DefinitionStatusId":"900000000000074008","FSN":"Diabetes mellitus (disorder)","Descriptions":[{"</w:t>
+      </w:r>
+      <w:proofErr w:type="spellStart"/>
+      <w:r>
+        <w:t>Term":"Diabetes</w:t>
+      </w:r>
+      <w:proofErr w:type="spellEnd"/>
+      <w:r>
+        <w:t xml:space="preserve"> mellitus (disorder)","TypeId":"900000000000003001"},{"</w:t>
+      </w:r>
+      <w:proofErr w:type="spellStart"/>
+      <w:r>
+        <w:t>Term":"Diabetes</w:t>
+      </w:r>
+      <w:proofErr w:type="spellEnd"/>
+      <w:r>
+        <w:t xml:space="preserve"> mellitus","TypeId":"900000000000013009"},{"</w:t>
+      </w:r>
+      <w:proofErr w:type="spellStart"/>
+      <w:r>
+        <w:t>Term":"DM</w:t>
+      </w:r>
+      <w:proofErr w:type="spellEnd"/>
+      <w:r>
+        <w:t xml:space="preserve"> - Diabetes mellitus","TypeId":"900000000000013009"}]}</w:t>
+      </w:r>
+    </w:p>
     <w:p>
       <w:r>
         <w:t xml:space="preserve">  Write ##class(SNOMED.Tools.Lookup).GetConcept("22298006")</w:t>
       </w:r>
     </w:p>
+    <w:p>
+      <w:r>
+        <w:t>{"ConceptId":"22298006","Active":1,"DefinitionStatusId":"900000000000073002","FSN":"Myocardial infarction (disorder)","Descriptions":[{"</w:t>
+      </w:r>
+      <w:proofErr w:type="spellStart"/>
+      <w:r>
+        <w:t>Term":"Myocardial</w:t>
+      </w:r>
+      <w:proofErr w:type="spellEnd"/>
+      <w:r>
+        <w:t xml:space="preserve"> infarction (disorder)","TypeId":"900000000000003001"},{"</w:t>
+      </w:r>
+      <w:proofErr w:type="spellStart"/>
+      <w:r>
+        <w:t>Term":"Cardiac</w:t>
+      </w:r>
+      <w:proofErr w:type="spellEnd"/>
+      <w:r>
+        <w:t xml:space="preserve"> infarction","TypeId":"900000000000013009"},{"</w:t>
+      </w:r>
+      <w:proofErr w:type="spellStart"/>
+      <w:r>
+        <w:t>Term":"Heart</w:t>
+      </w:r>
+      <w:proofErr w:type="spellEnd"/>
+      <w:r>
+        <w:t xml:space="preserve"> attack","TypeId":"900000000000013009"},{"</w:t>
+      </w:r>
+      <w:proofErr w:type="spellStart"/>
+      <w:r>
+        <w:t>Term":"Infarction</w:t>
+      </w:r>
+      <w:proofErr w:type="spellEnd"/>
+      <w:r>
+        <w:t xml:space="preserve"> of heart","TypeId":"900000000000013009"},{"</w:t>
+      </w:r>
+      <w:proofErr w:type="spellStart"/>
+      <w:r>
+        <w:t>Term":"MI</w:t>
+      </w:r>
+      <w:proofErr w:type="spellEnd"/>
+      <w:r>
+        <w:t xml:space="preserve"> - myocardial infarction","TypeId":"900000000000013009"},{"</w:t>
+      </w:r>
+      <w:proofErr w:type="spellStart"/>
+      <w:r>
+        <w:t>Term":"Myocardial</w:t>
+      </w:r>
+      <w:proofErr w:type="spellEnd"/>
+      <w:r>
+        <w:t xml:space="preserve"> infarct","TypeId":"900000000000013009"},{"</w:t>
+      </w:r>
+      <w:proofErr w:type="spellStart"/>
+      <w:r>
+        <w:t>Term":"Myocardial</w:t>
+      </w:r>
+      <w:proofErr w:type="spellEnd"/>
+      <w:r>
+        <w:t xml:space="preserve"> infarction","TypeId":"900000000000013009"}]}</w:t>
+      </w:r>
+    </w:p>
+    <w:p/>
     <w:p/>
     <w:p>
       <w:r>
         <w:t xml:space="preserve">  Lexical Search (full-text keyword)</w:t>
       </w:r>
     </w:p>
-    <w:p/>
     <w:p>
       <w:r>
         <w:t xml:space="preserve">  Write ##class(SNOMED.Search).Lexical("myocardial infarction", 5)</w:t>
       </w:r>
     </w:p>
+    <w:p/>
+    <w:p>
+      <w:r>
+        <w:lastRenderedPageBreak/>
+        <w:t>[{"ConceptId":"22298006","Term":"Myocardial infarction","TypeId":"900000000000013009"},{"ConceptId":"194821006","Term":"Aborted myocardial infarction","TypeId":"900000000000013009"},{"ConceptId":"54329005","Term":"Acute anterior myocardial infarction","TypeId":"900000000000013009"},{"ConceptId":"1204155000","Term":"Acute anterior non-ST segment elevation myocardial infarction","TypeId":"900000000000013009"},{"ConceptId":"1204155000","Term":"Acute anterior non-ST segment elevation myocardial infarction (disorder)","TypeId":"900000000000003001"}]</w:t>
+      </w:r>
+    </w:p>
     <w:p>
       <w:r>
         <w:t xml:space="preserve">  Write ##class(SNOMED.Search).Lexical("atrial fibrillation", 5)</w:t>
       </w:r>
     </w:p>
+    <w:p/>
+    <w:p>
+      <w:r>
+        <w:t>[{"ConceptId":"49436004","Term":"Atrial fibrillation","TypeId":"900000000000013009"},{"ConceptId":"49436004","Term":"AF - Atrial fibrillation","TypeId":"900000000000013009"},{"ConceptId":"282825002","Term":"AF - Paroxysmal atrial fibrillation","TypeId":"900000000000013009"},{"ConceptId":"719077007","Term":"At high risk of atrial fibrillation","TypeId":"900000000000013009"},{"ConceptId":"719077007","Term":"At high risk of atrial fibrillation (finding)","TypeId":"900000000000003001"}]</w:t>
+      </w:r>
+    </w:p>
     <w:p>
       <w:r>
         <w:t xml:space="preserve">  Write ##class(SNOMED.Search).Lexical("heart failure", 5)</w:t>
       </w:r>
     </w:p>
-    <w:p/>
+    <w:p>
+      <w:r>
+        <w:t>[{"ConceptId":"84114007","Term":"Heart failure","TypeId":"900000000000013009"},{"ConceptId":"153931000119109","Term":"Acute combined systolic and diastolic heart failure","TypeId":"900000000000013009"},{"ConceptId":"153931000119109","Term":"Acute combined systolic and diastolic heart failure (disorder)","TypeId":"900000000000003001"},{"ConceptId":"10633002","Term":"Acute congestive heart failure","TypeId":"900000000000013009"},{"ConceptId":"10633002","Term":"Acute congestive heart failure (disorder)","TypeId":"900000000000003001"}]</w:t>
+      </w:r>
+    </w:p>
     <w:p>
       <w:r>
         <w:t xml:space="preserve">  Parents</w:t>
@@ -61,9 +198,14 @@
         <w:t xml:space="preserve">  Write ##class(SNOMED.Hierarchy).GetParents("44054006")</w:t>
       </w:r>
     </w:p>
-    <w:p/>
-    <w:p>
-      <w:r>
+    <w:p>
+      <w:r>
+        <w:t>["73211009"]</w:t>
+      </w:r>
+    </w:p>
+    <w:p>
+      <w:r>
+        <w:lastRenderedPageBreak/>
         <w:t xml:space="preserve">  Children</w:t>
       </w:r>
     </w:p>
@@ -73,7 +215,11 @@
         <w:t xml:space="preserve">  Write ##class(SNOMED.Hierarchy).GetChildren("73211009")</w:t>
       </w:r>
     </w:p>
-    <w:p/>
+    <w:p>
+      <w:r>
+        <w:t>["8801005","11530004","44054006","46635009","123763000","199223000","405749004","703136005","716362006","722206009","733072002","890171006","530558861000132104"]</w:t>
+      </w:r>
+    </w:p>
     <w:p>
       <w:r>
         <w:t xml:space="preserve">  Ancestors</w:t>
@@ -85,7 +231,11 @@
         <w:t xml:space="preserve">  Write ##class(SNOMED.Hierarchy).GetAncestors("44054006")</w:t>
       </w:r>
     </w:p>
-    <w:p/>
+    <w:p>
+      <w:r>
+        <w:t>["20957000","64572001","73211009","75934005","126877002","138875005","362965005","362969004","404684003"]</w:t>
+      </w:r>
+    </w:p>
     <w:p>
       <w:r>
         <w:t xml:space="preserve">  Descendants (first 10)</w:t>
@@ -97,9 +247,14 @@
         <w:t xml:space="preserve">  Write ##class(SNOMED.Hierarchy).GetDescendants("73211009")</w:t>
       </w:r>
     </w:p>
-    <w:p/>
-    <w:p>
-      <w:r>
+    <w:p>
+      <w:r>
+        <w:t>["2751001","4783006","5368009","5969009","8801005","11530004","11687002","23045005","24203005","28032008","33559001","42954008","44054006","46635009","46894009","49817004","51002006","57886004","59079001","70694009","75022004","75524006","75682002","76751001","81531005","91352004","111307005","123763000","127012008","190368000","190372001","190389009","190447002","199223000","199229001","199230006","199231005","237599002","237600004","237601000","237603002","237604008","237611007","237612000","237617006","237619009","237627000","237651005","237652003","276560009","290002008","359642000","405749004","408540003","426875007","427089005","443694000","444073006","444074000","444110003","445260006","445353002","472699005","609561005","609562003","609563008","609564002","609565001","609566000","609567009","609568004","609569007","609570008","609571007","609572000","609573005","609574004","609575003","609576002","609577006","609578001","609579009","609580007","609581006","703136005","703137001","703138006","709147009","716362006","720519003","721088003","722206009","722454003","724067006","733072002","734022008","737212004","782755007","782825008","783722008","816067005","870528001","890171006","1142044000","1197592001","1217044000","1217068008","1255271005","1285518004","1285519007","1303868000","1367802006","1481000119100","31321000119102","40791000119105","40801000119106","105401000119101","106281000119103","164971000119101","367391000119102","721201000124104","10753491000119101","10754881000119104","530558861000132104"]</w:t>
+      </w:r>
+    </w:p>
+    <w:p>
+      <w:r>
+        <w:lastRenderedPageBreak/>
         <w:t xml:space="preserve">  Subsumption (IS-A) — returns 1 or 0</w:t>
       </w:r>
     </w:p>
@@ -111,9 +266,19 @@
     </w:p>
     <w:p>
       <w:r>
+        <w:t>1</w:t>
+      </w:r>
+    </w:p>
+    <w:p>
+      <w:r>
         <w:t xml:space="preserve">  Write ##class(SNOMED.Hierarchy).IsDescendantOf("71620000", "73211009")</w:t>
       </w:r>
     </w:p>
+    <w:p>
+      <w:r>
+        <w:t>0</w:t>
+      </w:r>
+    </w:p>
     <w:p/>
     <w:p>
       <w:r>
@@ -128,7 +293,756 @@
         <w:t>)</w:t>
       </w:r>
     </w:p>
-    <w:p/>
+    <w:p>
+      <w:r>
+        <w:t>┌─────</w:t>
+      </w:r>
+      <w:r>
+        <w:rPr>
+          <w:rFonts w:ascii="MS Gothic" w:eastAsia="MS Gothic" w:hAnsi="MS Gothic" w:cs="MS Gothic" w:hint="eastAsia"/>
+        </w:rPr>
+        <w:t>┬</w:t>
+      </w:r>
+      <w:r>
+        <w:t>────────────</w:t>
+      </w:r>
+      <w:r>
+        <w:rPr>
+          <w:rFonts w:ascii="MS Gothic" w:eastAsia="MS Gothic" w:hAnsi="MS Gothic" w:cs="MS Gothic" w:hint="eastAsia"/>
+        </w:rPr>
+        <w:t>┬</w:t>
+      </w:r>
+      <w:r>
+        <w:t>─────────</w:t>
+      </w:r>
+      <w:r>
+        <w:rPr>
+          <w:rFonts w:ascii="MS Gothic" w:eastAsia="MS Gothic" w:hAnsi="MS Gothic" w:cs="MS Gothic" w:hint="eastAsia"/>
+        </w:rPr>
+        <w:t>┬</w:t>
+      </w:r>
+      <w:r>
+        <w:t>────────────</w:t>
+      </w:r>
+      <w:r>
+        <w:rPr>
+          <w:rFonts w:ascii="MS Gothic" w:eastAsia="MS Gothic" w:hAnsi="MS Gothic" w:cs="MS Gothic" w:hint="eastAsia"/>
+        </w:rPr>
+        <w:t>┬</w:t>
+      </w:r>
+      <w:r>
+        <w:t>─────────────────────────────────────────────────────────────────────┐</w:t>
+      </w:r>
+    </w:p>
+    <w:p>
+      <w:r>
+        <w:t xml:space="preserve">  │  #  │ Parameter  │  Type   │  Default   │                             Description                             │                                                         </w:t>
+      </w:r>
+    </w:p>
+    <w:p>
+      <w:r>
+        <w:t xml:space="preserve">  </w:t>
+      </w:r>
+      <w:r>
+        <w:rPr>
+          <w:rFonts w:ascii="MS Gothic" w:eastAsia="MS Gothic" w:hAnsi="MS Gothic" w:cs="MS Gothic" w:hint="eastAsia"/>
+        </w:rPr>
+        <w:t>├</w:t>
+      </w:r>
+      <w:r>
+        <w:t>─────</w:t>
+      </w:r>
+      <w:r>
+        <w:rPr>
+          <w:rFonts w:ascii="MS Gothic" w:eastAsia="MS Gothic" w:hAnsi="MS Gothic" w:cs="MS Gothic" w:hint="eastAsia"/>
+        </w:rPr>
+        <w:t>┼</w:t>
+      </w:r>
+      <w:r>
+        <w:t>────────────</w:t>
+      </w:r>
+      <w:r>
+        <w:rPr>
+          <w:rFonts w:ascii="MS Gothic" w:eastAsia="MS Gothic" w:hAnsi="MS Gothic" w:cs="MS Gothic" w:hint="eastAsia"/>
+        </w:rPr>
+        <w:t>┼</w:t>
+      </w:r>
+      <w:r>
+        <w:t>─────────</w:t>
+      </w:r>
+      <w:r>
+        <w:rPr>
+          <w:rFonts w:ascii="MS Gothic" w:eastAsia="MS Gothic" w:hAnsi="MS Gothic" w:cs="MS Gothic" w:hint="eastAsia"/>
+        </w:rPr>
+        <w:t>┼</w:t>
+      </w:r>
+      <w:r>
+        <w:t>────────────</w:t>
+      </w:r>
+      <w:r>
+        <w:rPr>
+          <w:rFonts w:ascii="MS Gothic" w:eastAsia="MS Gothic" w:hAnsi="MS Gothic" w:cs="MS Gothic" w:hint="eastAsia"/>
+        </w:rPr>
+        <w:t>┼</w:t>
+      </w:r>
+      <w:r>
+        <w:t>─────────────────────────────────────────────────────────────────────</w:t>
+      </w:r>
+      <w:r>
+        <w:rPr>
+          <w:rFonts w:ascii="MS Gothic" w:eastAsia="MS Gothic" w:hAnsi="MS Gothic" w:cs="MS Gothic" w:hint="eastAsia"/>
+        </w:rPr>
+        <w:t>┤</w:t>
+      </w:r>
+      <w:r>
+        <w:t xml:space="preserve">                                                         </w:t>
+      </w:r>
+    </w:p>
+    <w:p>
+      <w:r>
+        <w:t xml:space="preserve">  │ 1   │ term       │ String  │ (required) │ The keyword or phrase to search for (e.g., "myocardial infarction") │                                                         </w:t>
+      </w:r>
+    </w:p>
+    <w:p>
+      <w:r>
+        <w:t xml:space="preserve">  </w:t>
+      </w:r>
+      <w:r>
+        <w:rPr>
+          <w:rFonts w:ascii="MS Gothic" w:eastAsia="MS Gothic" w:hAnsi="MS Gothic" w:cs="MS Gothic" w:hint="eastAsia"/>
+        </w:rPr>
+        <w:t>├</w:t>
+      </w:r>
+      <w:r>
+        <w:t>─────</w:t>
+      </w:r>
+      <w:r>
+        <w:rPr>
+          <w:rFonts w:ascii="MS Gothic" w:eastAsia="MS Gothic" w:hAnsi="MS Gothic" w:cs="MS Gothic" w:hint="eastAsia"/>
+        </w:rPr>
+        <w:t>┼</w:t>
+      </w:r>
+      <w:r>
+        <w:t>────────────</w:t>
+      </w:r>
+      <w:r>
+        <w:rPr>
+          <w:rFonts w:ascii="MS Gothic" w:eastAsia="MS Gothic" w:hAnsi="MS Gothic" w:cs="MS Gothic" w:hint="eastAsia"/>
+        </w:rPr>
+        <w:t>┼</w:t>
+      </w:r>
+      <w:r>
+        <w:t>─────────</w:t>
+      </w:r>
+      <w:r>
+        <w:rPr>
+          <w:rFonts w:ascii="MS Gothic" w:eastAsia="MS Gothic" w:hAnsi="MS Gothic" w:cs="MS Gothic" w:hint="eastAsia"/>
+        </w:rPr>
+        <w:t>┼</w:t>
+      </w:r>
+      <w:r>
+        <w:t>────────────</w:t>
+      </w:r>
+      <w:r>
+        <w:rPr>
+          <w:rFonts w:ascii="MS Gothic" w:eastAsia="MS Gothic" w:hAnsi="MS Gothic" w:cs="MS Gothic" w:hint="eastAsia"/>
+        </w:rPr>
+        <w:t>┼</w:t>
+      </w:r>
+      <w:r>
+        <w:t>─────────────────────────────────────────────────────────────────────</w:t>
+      </w:r>
+      <w:r>
+        <w:rPr>
+          <w:rFonts w:ascii="MS Gothic" w:eastAsia="MS Gothic" w:hAnsi="MS Gothic" w:cs="MS Gothic" w:hint="eastAsia"/>
+        </w:rPr>
+        <w:t>┤</w:t>
+      </w:r>
+      <w:r>
+        <w:t xml:space="preserve">                                                         </w:t>
+      </w:r>
+    </w:p>
+    <w:p>
+      <w:r>
+        <w:t xml:space="preserve">  │ 2   │ </w:t>
+      </w:r>
+      <w:proofErr w:type="spellStart"/>
+      <w:r>
+        <w:t>maxResults</w:t>
+      </w:r>
+      <w:proofErr w:type="spellEnd"/>
+      <w:r>
+        <w:t xml:space="preserve"> │ Integer │ 25         │ Maximum number of results to return                                 │                                                         </w:t>
+      </w:r>
+    </w:p>
+    <w:p>
+      <w:r>
+        <w:t xml:space="preserve">  └─────</w:t>
+      </w:r>
+      <w:r>
+        <w:rPr>
+          <w:rFonts w:ascii="MS Gothic" w:eastAsia="MS Gothic" w:hAnsi="MS Gothic" w:cs="MS Gothic" w:hint="eastAsia"/>
+        </w:rPr>
+        <w:t>┴</w:t>
+      </w:r>
+      <w:r>
+        <w:t>────────────</w:t>
+      </w:r>
+      <w:r>
+        <w:rPr>
+          <w:rFonts w:ascii="MS Gothic" w:eastAsia="MS Gothic" w:hAnsi="MS Gothic" w:cs="MS Gothic" w:hint="eastAsia"/>
+        </w:rPr>
+        <w:t>┴</w:t>
+      </w:r>
+      <w:r>
+        <w:t>─────────</w:t>
+      </w:r>
+      <w:r>
+        <w:rPr>
+          <w:rFonts w:ascii="MS Gothic" w:eastAsia="MS Gothic" w:hAnsi="MS Gothic" w:cs="MS Gothic" w:hint="eastAsia"/>
+        </w:rPr>
+        <w:t>┴</w:t>
+      </w:r>
+      <w:r>
+        <w:t>────────────</w:t>
+      </w:r>
+      <w:r>
+        <w:rPr>
+          <w:rFonts w:ascii="MS Gothic" w:eastAsia="MS Gothic" w:hAnsi="MS Gothic" w:cs="MS Gothic" w:hint="eastAsia"/>
+        </w:rPr>
+        <w:t>┴</w:t>
+      </w:r>
+      <w:r>
+        <w:t xml:space="preserve">─────────────────────────────────────────────────────────────────────┘                                                         </w:t>
+      </w:r>
+    </w:p>
+    <w:p>
+      <w:r>
+        <w:t xml:space="preserve">                                                                                                                                                                            </w:t>
+      </w:r>
+    </w:p>
+    <w:p>
+      <w:r>
+        <w:t xml:space="preserve">  Example: Write ##class(SNOMED.Search).Lexical("heart failure", 5)                                                                                                         </w:t>
+      </w:r>
+    </w:p>
+    <w:p>
+      <w:r>
+        <w:t xml:space="preserve">                  </w:t>
+      </w:r>
+    </w:p>
+    <w:p>
+      <w:r>
+        <w:t xml:space="preserve">  ---                                                                                                                                                                       </w:t>
+      </w:r>
+    </w:p>
+    <w:p>
+      <w:r>
+        <w:t xml:space="preserve">  </w:t>
+      </w:r>
+      <w:proofErr w:type="spellStart"/>
+      <w:r>
+        <w:t>SNOMED.Search.Semantic</w:t>
+      </w:r>
+      <w:proofErr w:type="spellEnd"/>
+      <w:r>
+        <w:t xml:space="preserve">(query, </w:t>
+      </w:r>
+      <w:proofErr w:type="spellStart"/>
+      <w:r>
+        <w:t>maxResults</w:t>
+      </w:r>
+      <w:proofErr w:type="spellEnd"/>
+      <w:r>
+        <w:t xml:space="preserve">, </w:t>
+      </w:r>
+      <w:proofErr w:type="spellStart"/>
+      <w:r>
+        <w:t>minScore</w:t>
+      </w:r>
+      <w:proofErr w:type="spellEnd"/>
+      <w:r>
+        <w:t xml:space="preserve">, </w:t>
+      </w:r>
+      <w:proofErr w:type="spellStart"/>
+      <w:r>
+        <w:t>ollamaUrl</w:t>
+      </w:r>
+      <w:proofErr w:type="spellEnd"/>
+      <w:r>
+        <w:t xml:space="preserve">, </w:t>
+      </w:r>
+      <w:proofErr w:type="spellStart"/>
+      <w:r>
+        <w:t>modelName</w:t>
+      </w:r>
+      <w:proofErr w:type="spellEnd"/>
+      <w:r>
+        <w:t>)</w:t>
+      </w:r>
+    </w:p>
+    <w:p>
+      <w:r>
+        <w:t xml:space="preserve">                                                                                                                                                                            </w:t>
+      </w:r>
+    </w:p>
+    <w:p>
+      <w:r>
+        <w:lastRenderedPageBreak/>
+        <w:t xml:space="preserve">  ┌─────</w:t>
+      </w:r>
+      <w:r>
+        <w:rPr>
+          <w:rFonts w:ascii="MS Gothic" w:eastAsia="MS Gothic" w:hAnsi="MS Gothic" w:cs="MS Gothic" w:hint="eastAsia"/>
+        </w:rPr>
+        <w:t>┬</w:t>
+      </w:r>
+      <w:r>
+        <w:t>────────────</w:t>
+      </w:r>
+      <w:r>
+        <w:rPr>
+          <w:rFonts w:ascii="MS Gothic" w:eastAsia="MS Gothic" w:hAnsi="MS Gothic" w:cs="MS Gothic" w:hint="eastAsia"/>
+        </w:rPr>
+        <w:t>┬</w:t>
+      </w:r>
+      <w:r>
+        <w:t>─────────</w:t>
+      </w:r>
+      <w:r>
+        <w:rPr>
+          <w:rFonts w:ascii="MS Gothic" w:eastAsia="MS Gothic" w:hAnsi="MS Gothic" w:cs="MS Gothic" w:hint="eastAsia"/>
+        </w:rPr>
+        <w:t>┬</w:t>
+      </w:r>
+      <w:r>
+        <w:t>──────────────────────────</w:t>
+      </w:r>
+      <w:r>
+        <w:rPr>
+          <w:rFonts w:ascii="MS Gothic" w:eastAsia="MS Gothic" w:hAnsi="MS Gothic" w:cs="MS Gothic" w:hint="eastAsia"/>
+        </w:rPr>
+        <w:t>┬</w:t>
+      </w:r>
+      <w:r>
+        <w:t>────────────────────────────────────────────────────────────────────────────────┐</w:t>
+      </w:r>
+    </w:p>
+    <w:p>
+      <w:r>
+        <w:t xml:space="preserve">  │  #  │ Parameter  │  Type   │         Default          │                                  Description                                   │                                </w:t>
+      </w:r>
+    </w:p>
+    <w:p>
+      <w:r>
+        <w:t xml:space="preserve">  </w:t>
+      </w:r>
+      <w:r>
+        <w:rPr>
+          <w:rFonts w:ascii="MS Gothic" w:eastAsia="MS Gothic" w:hAnsi="MS Gothic" w:cs="MS Gothic" w:hint="eastAsia"/>
+        </w:rPr>
+        <w:t>├</w:t>
+      </w:r>
+      <w:r>
+        <w:t>─────</w:t>
+      </w:r>
+      <w:r>
+        <w:rPr>
+          <w:rFonts w:ascii="MS Gothic" w:eastAsia="MS Gothic" w:hAnsi="MS Gothic" w:cs="MS Gothic" w:hint="eastAsia"/>
+        </w:rPr>
+        <w:t>┼</w:t>
+      </w:r>
+      <w:r>
+        <w:t>────────────</w:t>
+      </w:r>
+      <w:r>
+        <w:rPr>
+          <w:rFonts w:ascii="MS Gothic" w:eastAsia="MS Gothic" w:hAnsi="MS Gothic" w:cs="MS Gothic" w:hint="eastAsia"/>
+        </w:rPr>
+        <w:t>┼</w:t>
+      </w:r>
+      <w:r>
+        <w:t>─────────</w:t>
+      </w:r>
+      <w:r>
+        <w:rPr>
+          <w:rFonts w:ascii="MS Gothic" w:eastAsia="MS Gothic" w:hAnsi="MS Gothic" w:cs="MS Gothic" w:hint="eastAsia"/>
+        </w:rPr>
+        <w:t>┼</w:t>
+      </w:r>
+      <w:r>
+        <w:t>──────────────────────────</w:t>
+      </w:r>
+      <w:r>
+        <w:rPr>
+          <w:rFonts w:ascii="MS Gothic" w:eastAsia="MS Gothic" w:hAnsi="MS Gothic" w:cs="MS Gothic" w:hint="eastAsia"/>
+        </w:rPr>
+        <w:t>┼</w:t>
+      </w:r>
+      <w:r>
+        <w:t>────────────────────────────────────────────────────────────────────────────────</w:t>
+      </w:r>
+      <w:r>
+        <w:rPr>
+          <w:rFonts w:ascii="MS Gothic" w:eastAsia="MS Gothic" w:hAnsi="MS Gothic" w:cs="MS Gothic" w:hint="eastAsia"/>
+        </w:rPr>
+        <w:t>┤</w:t>
+      </w:r>
+      <w:r>
+        <w:t xml:space="preserve">                                </w:t>
+      </w:r>
+    </w:p>
+    <w:p>
+      <w:r>
+        <w:t xml:space="preserve">  │ 1   │ query      │ String  │ (required)               │ Natural language description of the clinical concept to find                   │                                </w:t>
+      </w:r>
+    </w:p>
+    <w:p>
+      <w:r>
+        <w:t xml:space="preserve">  </w:t>
+      </w:r>
+      <w:r>
+        <w:rPr>
+          <w:rFonts w:ascii="MS Gothic" w:eastAsia="MS Gothic" w:hAnsi="MS Gothic" w:cs="MS Gothic" w:hint="eastAsia"/>
+        </w:rPr>
+        <w:t>├</w:t>
+      </w:r>
+      <w:r>
+        <w:t>─────</w:t>
+      </w:r>
+      <w:r>
+        <w:rPr>
+          <w:rFonts w:ascii="MS Gothic" w:eastAsia="MS Gothic" w:hAnsi="MS Gothic" w:cs="MS Gothic" w:hint="eastAsia"/>
+        </w:rPr>
+        <w:t>┼</w:t>
+      </w:r>
+      <w:r>
+        <w:t>────────────</w:t>
+      </w:r>
+      <w:r>
+        <w:rPr>
+          <w:rFonts w:ascii="MS Gothic" w:eastAsia="MS Gothic" w:hAnsi="MS Gothic" w:cs="MS Gothic" w:hint="eastAsia"/>
+        </w:rPr>
+        <w:t>┼</w:t>
+      </w:r>
+      <w:r>
+        <w:t>─────────</w:t>
+      </w:r>
+      <w:r>
+        <w:rPr>
+          <w:rFonts w:ascii="MS Gothic" w:eastAsia="MS Gothic" w:hAnsi="MS Gothic" w:cs="MS Gothic" w:hint="eastAsia"/>
+        </w:rPr>
+        <w:t>┼</w:t>
+      </w:r>
+      <w:r>
+        <w:t>──────────────────────────</w:t>
+      </w:r>
+      <w:r>
+        <w:rPr>
+          <w:rFonts w:ascii="MS Gothic" w:eastAsia="MS Gothic" w:hAnsi="MS Gothic" w:cs="MS Gothic" w:hint="eastAsia"/>
+        </w:rPr>
+        <w:t>┼</w:t>
+      </w:r>
+      <w:r>
+        <w:t>────────────────────────────────────────────────────────────────────────────────</w:t>
+      </w:r>
+      <w:r>
+        <w:rPr>
+          <w:rFonts w:ascii="MS Gothic" w:eastAsia="MS Gothic" w:hAnsi="MS Gothic" w:cs="MS Gothic" w:hint="eastAsia"/>
+        </w:rPr>
+        <w:t>┤</w:t>
+      </w:r>
+      <w:r>
+        <w:t xml:space="preserve">                                </w:t>
+      </w:r>
+    </w:p>
+    <w:p>
+      <w:r>
+        <w:t xml:space="preserve">  │ 2   │ </w:t>
+      </w:r>
+      <w:proofErr w:type="spellStart"/>
+      <w:r>
+        <w:t>maxResults</w:t>
+      </w:r>
+      <w:proofErr w:type="spellEnd"/>
+      <w:r>
+        <w:t xml:space="preserve"> │ Integer │ 10                       │ Maximum number of results to return                                            │                                </w:t>
+      </w:r>
+    </w:p>
+    <w:p>
+      <w:r>
+        <w:t xml:space="preserve">  </w:t>
+      </w:r>
+      <w:r>
+        <w:rPr>
+          <w:rFonts w:ascii="MS Gothic" w:eastAsia="MS Gothic" w:hAnsi="MS Gothic" w:cs="MS Gothic" w:hint="eastAsia"/>
+        </w:rPr>
+        <w:t>├</w:t>
+      </w:r>
+      <w:r>
+        <w:t>─────</w:t>
+      </w:r>
+      <w:r>
+        <w:rPr>
+          <w:rFonts w:ascii="MS Gothic" w:eastAsia="MS Gothic" w:hAnsi="MS Gothic" w:cs="MS Gothic" w:hint="eastAsia"/>
+        </w:rPr>
+        <w:t>┼</w:t>
+      </w:r>
+      <w:r>
+        <w:t>────────────</w:t>
+      </w:r>
+      <w:r>
+        <w:rPr>
+          <w:rFonts w:ascii="MS Gothic" w:eastAsia="MS Gothic" w:hAnsi="MS Gothic" w:cs="MS Gothic" w:hint="eastAsia"/>
+        </w:rPr>
+        <w:t>┼</w:t>
+      </w:r>
+      <w:r>
+        <w:t>─────────</w:t>
+      </w:r>
+      <w:r>
+        <w:rPr>
+          <w:rFonts w:ascii="MS Gothic" w:eastAsia="MS Gothic" w:hAnsi="MS Gothic" w:cs="MS Gothic" w:hint="eastAsia"/>
+        </w:rPr>
+        <w:t>┼</w:t>
+      </w:r>
+      <w:r>
+        <w:t>──────────────────────────</w:t>
+      </w:r>
+      <w:r>
+        <w:rPr>
+          <w:rFonts w:ascii="MS Gothic" w:eastAsia="MS Gothic" w:hAnsi="MS Gothic" w:cs="MS Gothic" w:hint="eastAsia"/>
+        </w:rPr>
+        <w:t>┼</w:t>
+      </w:r>
+      <w:r>
+        <w:t>────────────────────────────────────────────────────────────────────────────────</w:t>
+      </w:r>
+      <w:r>
+        <w:rPr>
+          <w:rFonts w:ascii="MS Gothic" w:eastAsia="MS Gothic" w:hAnsi="MS Gothic" w:cs="MS Gothic" w:hint="eastAsia"/>
+        </w:rPr>
+        <w:t>┤</w:t>
+      </w:r>
+      <w:r>
+        <w:t xml:space="preserve">                                </w:t>
+      </w:r>
+    </w:p>
+    <w:p>
+      <w:r>
+        <w:t xml:space="preserve">  │ 3   │ </w:t>
+      </w:r>
+      <w:proofErr w:type="spellStart"/>
+      <w:r>
+        <w:t>minScore</w:t>
+      </w:r>
+      <w:proofErr w:type="spellEnd"/>
+      <w:r>
+        <w:t xml:space="preserve">   │ Numeric │ 0.5                      │ Minimum cosine similarity threshold (0–1). Results below this are filtered out │                                </w:t>
+      </w:r>
+    </w:p>
+    <w:p>
+      <w:r>
+        <w:t xml:space="preserve">  </w:t>
+      </w:r>
+      <w:r>
+        <w:rPr>
+          <w:rFonts w:ascii="MS Gothic" w:eastAsia="MS Gothic" w:hAnsi="MS Gothic" w:cs="MS Gothic" w:hint="eastAsia"/>
+        </w:rPr>
+        <w:t>├</w:t>
+      </w:r>
+      <w:r>
+        <w:t>─────</w:t>
+      </w:r>
+      <w:r>
+        <w:rPr>
+          <w:rFonts w:ascii="MS Gothic" w:eastAsia="MS Gothic" w:hAnsi="MS Gothic" w:cs="MS Gothic" w:hint="eastAsia"/>
+        </w:rPr>
+        <w:t>┼</w:t>
+      </w:r>
+      <w:r>
+        <w:t>────────────</w:t>
+      </w:r>
+      <w:r>
+        <w:rPr>
+          <w:rFonts w:ascii="MS Gothic" w:eastAsia="MS Gothic" w:hAnsi="MS Gothic" w:cs="MS Gothic" w:hint="eastAsia"/>
+        </w:rPr>
+        <w:t>┼</w:t>
+      </w:r>
+      <w:r>
+        <w:t>─────────</w:t>
+      </w:r>
+      <w:r>
+        <w:rPr>
+          <w:rFonts w:ascii="MS Gothic" w:eastAsia="MS Gothic" w:hAnsi="MS Gothic" w:cs="MS Gothic" w:hint="eastAsia"/>
+        </w:rPr>
+        <w:t>┼</w:t>
+      </w:r>
+      <w:r>
+        <w:t>──────────────────────────</w:t>
+      </w:r>
+      <w:r>
+        <w:rPr>
+          <w:rFonts w:ascii="MS Gothic" w:eastAsia="MS Gothic" w:hAnsi="MS Gothic" w:cs="MS Gothic" w:hint="eastAsia"/>
+        </w:rPr>
+        <w:t>┼</w:t>
+      </w:r>
+      <w:r>
+        <w:t>────────────────────────────────────────────────────────────────────────────────</w:t>
+      </w:r>
+      <w:r>
+        <w:rPr>
+          <w:rFonts w:ascii="MS Gothic" w:eastAsia="MS Gothic" w:hAnsi="MS Gothic" w:cs="MS Gothic" w:hint="eastAsia"/>
+        </w:rPr>
+        <w:t>┤</w:t>
+      </w:r>
+      <w:r>
+        <w:t xml:space="preserve">                                </w:t>
+      </w:r>
+    </w:p>
+    <w:p>
+      <w:r>
+        <w:t xml:space="preserve">  │ 4   │ </w:t>
+      </w:r>
+      <w:proofErr w:type="spellStart"/>
+      <w:r>
+        <w:t>ollamaUrl</w:t>
+      </w:r>
+      <w:proofErr w:type="spellEnd"/>
+      <w:r>
+        <w:t xml:space="preserve">  │ String  │ "http://localhost:11434" │ </w:t>
+      </w:r>
+      <w:proofErr w:type="spellStart"/>
+      <w:r>
+        <w:t>Ollama</w:t>
+      </w:r>
+      <w:proofErr w:type="spellEnd"/>
+      <w:r>
+        <w:t xml:space="preserve"> server URL for generating the query embedding                           │</w:t>
+      </w:r>
+    </w:p>
+    <w:p>
+      <w:r>
+        <w:t xml:space="preserve">  </w:t>
+      </w:r>
+      <w:r>
+        <w:rPr>
+          <w:rFonts w:ascii="MS Gothic" w:eastAsia="MS Gothic" w:hAnsi="MS Gothic" w:cs="MS Gothic" w:hint="eastAsia"/>
+        </w:rPr>
+        <w:t>├</w:t>
+      </w:r>
+      <w:r>
+        <w:t>─────</w:t>
+      </w:r>
+      <w:r>
+        <w:rPr>
+          <w:rFonts w:ascii="MS Gothic" w:eastAsia="MS Gothic" w:hAnsi="MS Gothic" w:cs="MS Gothic" w:hint="eastAsia"/>
+        </w:rPr>
+        <w:t>┼</w:t>
+      </w:r>
+      <w:r>
+        <w:t>────────────</w:t>
+      </w:r>
+      <w:r>
+        <w:rPr>
+          <w:rFonts w:ascii="MS Gothic" w:eastAsia="MS Gothic" w:hAnsi="MS Gothic" w:cs="MS Gothic" w:hint="eastAsia"/>
+        </w:rPr>
+        <w:t>┼</w:t>
+      </w:r>
+      <w:r>
+        <w:t>─────────</w:t>
+      </w:r>
+      <w:r>
+        <w:rPr>
+          <w:rFonts w:ascii="MS Gothic" w:eastAsia="MS Gothic" w:hAnsi="MS Gothic" w:cs="MS Gothic" w:hint="eastAsia"/>
+        </w:rPr>
+        <w:t>┼</w:t>
+      </w:r>
+      <w:r>
+        <w:t>──────────────────────────</w:t>
+      </w:r>
+      <w:r>
+        <w:rPr>
+          <w:rFonts w:ascii="MS Gothic" w:eastAsia="MS Gothic" w:hAnsi="MS Gothic" w:cs="MS Gothic" w:hint="eastAsia"/>
+        </w:rPr>
+        <w:t>┼</w:t>
+      </w:r>
+      <w:r>
+        <w:t>────────────────────────────────────────────────────────────────────────────────</w:t>
+      </w:r>
+      <w:r>
+        <w:rPr>
+          <w:rFonts w:ascii="MS Gothic" w:eastAsia="MS Gothic" w:hAnsi="MS Gothic" w:cs="MS Gothic" w:hint="eastAsia"/>
+        </w:rPr>
+        <w:t>┤</w:t>
+      </w:r>
+      <w:r>
+        <w:t xml:space="preserve">                                </w:t>
+      </w:r>
+    </w:p>
+    <w:p>
+      <w:r>
+        <w:t xml:space="preserve">  │ 5   │ </w:t>
+      </w:r>
+      <w:proofErr w:type="spellStart"/>
+      <w:r>
+        <w:t>modelName</w:t>
+      </w:r>
+      <w:proofErr w:type="spellEnd"/>
+      <w:r>
+        <w:t xml:space="preserve">  │ String  │ "all-</w:t>
+      </w:r>
+      <w:proofErr w:type="spellStart"/>
+      <w:r>
+        <w:t>minilm</w:t>
+      </w:r>
+      <w:proofErr w:type="spellEnd"/>
+      <w:r>
+        <w:t>"             │ Embedding model name (must match the model used during generation)             │</w:t>
+      </w:r>
+    </w:p>
+    <w:p>
+      <w:r>
+        <w:lastRenderedPageBreak/>
+        <w:t xml:space="preserve">  └─────</w:t>
+      </w:r>
+      <w:r>
+        <w:rPr>
+          <w:rFonts w:ascii="MS Gothic" w:eastAsia="MS Gothic" w:hAnsi="MS Gothic" w:cs="MS Gothic" w:hint="eastAsia"/>
+        </w:rPr>
+        <w:t>┴</w:t>
+      </w:r>
+      <w:r>
+        <w:t>────────────</w:t>
+      </w:r>
+      <w:r>
+        <w:rPr>
+          <w:rFonts w:ascii="MS Gothic" w:eastAsia="MS Gothic" w:hAnsi="MS Gothic" w:cs="MS Gothic" w:hint="eastAsia"/>
+        </w:rPr>
+        <w:t>┴</w:t>
+      </w:r>
+      <w:r>
+        <w:t>─────────</w:t>
+      </w:r>
+      <w:r>
+        <w:rPr>
+          <w:rFonts w:ascii="MS Gothic" w:eastAsia="MS Gothic" w:hAnsi="MS Gothic" w:cs="MS Gothic" w:hint="eastAsia"/>
+        </w:rPr>
+        <w:t>┴</w:t>
+      </w:r>
+      <w:r>
+        <w:t>──────────────────────────</w:t>
+      </w:r>
+      <w:r>
+        <w:rPr>
+          <w:rFonts w:ascii="MS Gothic" w:eastAsia="MS Gothic" w:hAnsi="MS Gothic" w:cs="MS Gothic" w:hint="eastAsia"/>
+        </w:rPr>
+        <w:t>┴</w:t>
+      </w:r>
+      <w:r>
+        <w:t>────────────────────────────────────────────────────────────────────────────────┘</w:t>
+      </w:r>
+    </w:p>
     <w:p>
       <w:r>
         <w:t xml:space="preserve">  Write ##class(SNOMED.Search).Semantic("chest pain when breathing", 5, 0.5, "http://host.docker.internal:11434")</w:t>
@@ -136,12 +1050,849 @@
     </w:p>
     <w:p>
       <w:r>
+        <w:t>[{"</w:t>
+      </w:r>
+      <w:proofErr w:type="spellStart"/>
+      <w:r>
+        <w:t>ConceptId</w:t>
+      </w:r>
+      <w:proofErr w:type="spellEnd"/>
+      <w:r>
+        <w:t>": "274664007", "Term": "Chest pain on breathing (finding)", "Score": 0.9178}, {"</w:t>
+      </w:r>
+      <w:proofErr w:type="spellStart"/>
+      <w:r>
+        <w:t>ConceptId</w:t>
+      </w:r>
+      <w:proofErr w:type="spellEnd"/>
+      <w:r>
+        <w:t>": "161971004", "Term": "Chest pain not present (situation)", "Score": 0.7608}, {"</w:t>
+      </w:r>
+      <w:proofErr w:type="spellStart"/>
+      <w:r>
+        <w:t>ConceptId</w:t>
+      </w:r>
+      <w:proofErr w:type="spellEnd"/>
+      <w:r>
+        <w:t>": "426976009", "Term": "Pain provoked by breathing (finding)", "Score": 0.7464}, {"</w:t>
+      </w:r>
+      <w:proofErr w:type="spellStart"/>
+      <w:r>
+        <w:t>ConceptId</w:t>
+      </w:r>
+      <w:proofErr w:type="spellEnd"/>
+      <w:r>
+        <w:t>": "3368006", "Term": "Dull chest pain (finding)", "Score": 0.744}, {"</w:t>
+      </w:r>
+      <w:proofErr w:type="spellStart"/>
+      <w:r>
+        <w:t>ConceptId</w:t>
+      </w:r>
+      <w:proofErr w:type="spellEnd"/>
+      <w:r>
+        <w:t>": "29857009", "Term": "Chest pain (finding)", "Score": 0.7394}]</w:t>
+      </w:r>
+    </w:p>
+    <w:p>
+      <w:r>
         <w:t xml:space="preserve">  Write ##class(SNOMED.Search).Semantic("difficulty swallowing food", 5, 0.5, "http://host.docker.internal:11434")</w:t>
       </w:r>
     </w:p>
     <w:p>
       <w:r>
+        <w:t>[{"</w:t>
+      </w:r>
+      <w:proofErr w:type="spellStart"/>
+      <w:r>
+        <w:t>ConceptId</w:t>
+      </w:r>
+      <w:proofErr w:type="spellEnd"/>
+      <w:r>
+        <w:t>": "288945004", "Term": "Difficulty swallowing food (finding)", "Score": 0.8927}, {"</w:t>
+      </w:r>
+      <w:proofErr w:type="spellStart"/>
+      <w:r>
+        <w:t>ConceptId</w:t>
+      </w:r>
+      <w:proofErr w:type="spellEnd"/>
+      <w:r>
+        <w:t>": "288942001", "Term": "Unable to swallow food (finding)", "Score": 0.8263}, {"</w:t>
+      </w:r>
+      <w:proofErr w:type="spellStart"/>
+      <w:r>
+        <w:t>ConceptId</w:t>
+      </w:r>
+      <w:proofErr w:type="spellEnd"/>
+      <w:r>
+        <w:t>": "306778008", "Term": "Difficulty swallowing soft foods (finding)", "Score": 0.8147}, {"</w:t>
+      </w:r>
+      <w:proofErr w:type="spellStart"/>
+      <w:r>
+        <w:t>ConceptId</w:t>
+      </w:r>
+      <w:proofErr w:type="spellEnd"/>
+      <w:r>
+        <w:t>": "288939007", "Term": "Difficulty swallowing (finding)", "Score": 0.791}, {"</w:t>
+      </w:r>
+      <w:proofErr w:type="spellStart"/>
+      <w:r>
+        <w:t>ConceptId</w:t>
+      </w:r>
+      <w:proofErr w:type="spellEnd"/>
+      <w:r>
+        <w:t>": "306775006", "Term": "Unable to swallow soft foods (finding)", "Score": 0.7738}]</w:t>
+      </w:r>
+    </w:p>
+    <w:p/>
+    <w:p>
+      <w:r>
         <w:t xml:space="preserve">  Write ##class(SNOMED.Search).Semantic("rash on both arms", 5, 0.5, "http://host.docker.internal:11434")</w:t>
+      </w:r>
+    </w:p>
+    <w:p>
+      <w:r>
+        <w:t>Write ##class(SNOMED.Search).Semantic("rash on both arms", 5, 0.5, "http://host.docker.internal:11434")</w:t>
+      </w:r>
+    </w:p>
+    <w:p>
+      <w:r>
+        <w:t>[{"</w:t>
+      </w:r>
+      <w:proofErr w:type="spellStart"/>
+      <w:r>
+        <w:t>ConceptId</w:t>
+      </w:r>
+      <w:proofErr w:type="spellEnd"/>
+      <w:r>
+        <w:t>": "827160004", "Term": "Erythematous rash (disorder)", "Score": 0.6899}, {"</w:t>
+      </w:r>
+      <w:proofErr w:type="spellStart"/>
+      <w:r>
+        <w:t>ConceptId</w:t>
+      </w:r>
+      <w:proofErr w:type="spellEnd"/>
+      <w:r>
+        <w:t>": "213323001", "Term": "Serum rash (disorder)", "Score": 0.6758}, {"</w:t>
+      </w:r>
+      <w:proofErr w:type="spellStart"/>
+      <w:r>
+        <w:t>ConceptId</w:t>
+      </w:r>
+      <w:proofErr w:type="spellEnd"/>
+      <w:r>
+        <w:t>": "725119006", "Term": "Generalized rash (disorder)", "Score": 0.6721}, {"</w:t>
+      </w:r>
+      <w:proofErr w:type="spellStart"/>
+      <w:r>
+        <w:t>ConceptId</w:t>
+      </w:r>
+      <w:proofErr w:type="spellEnd"/>
+      <w:r>
+        <w:t>": "95371007", "Term": "Application site rash (disorder)", "Score": 0.6606}, {"</w:t>
+      </w:r>
+      <w:proofErr w:type="spellStart"/>
+      <w:r>
+        <w:t>ConceptId</w:t>
+      </w:r>
+      <w:proofErr w:type="spellEnd"/>
+      <w:r>
+        <w:t>": "81843002", "Term": "Impetiginous rash (morphologic abnormality)", "Score": 0.6526}]</w:t>
+      </w:r>
+    </w:p>
+    <w:p>
+      <w:pPr>
+        <w:pStyle w:val="Heading1"/>
+      </w:pPr>
+      <w:r>
+        <w:t>Tests Using the MCP server (Exposed through AI Hub)</w:t>
+      </w:r>
+    </w:p>
+    <w:p/>
+    <w:p/>
+    <w:p>
+      <w:pPr>
+        <w:pStyle w:val="Heading2"/>
+      </w:pPr>
+      <w:r>
+        <w:lastRenderedPageBreak/>
+        <w:t>First configure your LLM Client</w:t>
+      </w:r>
+    </w:p>
+    <w:p/>
+    <w:p>
+      <w:r>
+        <w:t xml:space="preserve">     {</w:t>
+      </w:r>
+    </w:p>
+    <w:p>
+      <w:r>
+        <w:t xml:space="preserve">       "</w:t>
+      </w:r>
+      <w:proofErr w:type="spellStart"/>
+      <w:r>
+        <w:t>mcpServers</w:t>
+      </w:r>
+      <w:proofErr w:type="spellEnd"/>
+      <w:r>
+        <w:t>": {</w:t>
+      </w:r>
+    </w:p>
+    <w:p>
+      <w:r>
+        <w:t xml:space="preserve">         "</w:t>
+      </w:r>
+      <w:proofErr w:type="spellStart"/>
+      <w:r>
+        <w:t>snomed</w:t>
+      </w:r>
+      <w:proofErr w:type="spellEnd"/>
+      <w:r>
+        <w:t>": {</w:t>
+      </w:r>
+    </w:p>
+    <w:p>
+      <w:r>
+        <w:t xml:space="preserve">           "command": "docker",</w:t>
+      </w:r>
+    </w:p>
+    <w:p>
+      <w:r>
+        <w:t xml:space="preserve">           "args": ["exec", "-</w:t>
+      </w:r>
+      <w:proofErr w:type="spellStart"/>
+      <w:r>
+        <w:t>i</w:t>
+      </w:r>
+      <w:proofErr w:type="spellEnd"/>
+      <w:r>
+        <w:t>", "</w:t>
+      </w:r>
+      <w:proofErr w:type="spellStart"/>
+      <w:r>
+        <w:t>snomed</w:t>
+      </w:r>
+      <w:proofErr w:type="spellEnd"/>
+      <w:r>
+        <w:t>-iris", "/</w:t>
+      </w:r>
+      <w:proofErr w:type="spellStart"/>
+      <w:r>
+        <w:t>usr</w:t>
+      </w:r>
+      <w:proofErr w:type="spellEnd"/>
+      <w:r>
+        <w:t>/</w:t>
+      </w:r>
+      <w:proofErr w:type="spellStart"/>
+      <w:r>
+        <w:t>irissys</w:t>
+      </w:r>
+      <w:proofErr w:type="spellEnd"/>
+      <w:r>
+        <w:t>/bin/iris-</w:t>
+      </w:r>
+      <w:proofErr w:type="spellStart"/>
+      <w:r>
+        <w:t>mcp</w:t>
+      </w:r>
+      <w:proofErr w:type="spellEnd"/>
+      <w:r>
+        <w:t>-server", "--config", "/opt/iris/config/</w:t>
+      </w:r>
+      <w:proofErr w:type="spellStart"/>
+      <w:r>
+        <w:t>mcp-config.toml</w:t>
+      </w:r>
+      <w:proofErr w:type="spellEnd"/>
+      <w:r>
+        <w:t>", "run"]</w:t>
+      </w:r>
+    </w:p>
+    <w:p>
+      <w:r>
+        <w:t xml:space="preserve">         }</w:t>
+      </w:r>
+    </w:p>
+    <w:p>
+      <w:r>
+        <w:t xml:space="preserve">       }</w:t>
+      </w:r>
+    </w:p>
+    <w:p>
+      <w:r>
+        <w:t xml:space="preserve">     }</w:t>
+      </w:r>
+    </w:p>
+    <w:p/>
+    <w:p/>
+    <w:p>
+      <w:r>
+        <w:rPr>
+          <w:rFonts w:ascii="Apple Color Emoji" w:hAnsi="Apple Color Emoji" w:cs="Apple Color Emoji"/>
+        </w:rPr>
+        <w:t>⏺</w:t>
+      </w:r>
+      <w:r>
+        <w:t xml:space="preserve"> Done. The MCP server is now configured for Claude Code via .</w:t>
+      </w:r>
+      <w:proofErr w:type="spellStart"/>
+      <w:r>
+        <w:t>mcp.json</w:t>
+      </w:r>
+      <w:proofErr w:type="spellEnd"/>
+      <w:r>
+        <w:t xml:space="preserve"> in this project directory. It uses docker exec to run iris-</w:t>
+      </w:r>
+      <w:proofErr w:type="spellStart"/>
+      <w:r>
+        <w:t>mcp</w:t>
+      </w:r>
+      <w:proofErr w:type="spellEnd"/>
+      <w:r>
+        <w:t>-server inside the container — no macOS</w:t>
+      </w:r>
+    </w:p>
+    <w:p>
+      <w:r>
+        <w:t xml:space="preserve">   binary needed.</w:t>
+      </w:r>
+    </w:p>
+    <w:p/>
+    <w:p>
+      <w:r>
+        <w:t xml:space="preserve">  To activate it: You need to restart Claude Code (exit and re-enter this project). When you restart, Claude Code will detect the .</w:t>
+      </w:r>
+      <w:proofErr w:type="spellStart"/>
+      <w:r>
+        <w:t>mcp.json</w:t>
+      </w:r>
+      <w:proofErr w:type="spellEnd"/>
+      <w:r>
+        <w:t xml:space="preserve"> and ask you to approve the</w:t>
+      </w:r>
+    </w:p>
+    <w:p>
+      <w:r>
+        <w:t xml:space="preserve">  </w:t>
+      </w:r>
+      <w:proofErr w:type="spellStart"/>
+      <w:r>
+        <w:t>snomed</w:t>
+      </w:r>
+      <w:proofErr w:type="spellEnd"/>
+      <w:r>
+        <w:t xml:space="preserve"> MCP server.</w:t>
+      </w:r>
+    </w:p>
+    <w:p/>
+    <w:p>
+      <w:r>
+        <w:t>T</w:t>
+      </w:r>
+      <w:r>
+        <w:t>est prompts for your new Claude Code session:</w:t>
+      </w:r>
+    </w:p>
+    <w:p/>
+    <w:p>
+      <w:r>
+        <w:t xml:space="preserve">  Basic Lookup</w:t>
+      </w:r>
+    </w:p>
+    <w:p/>
+    <w:p>
+      <w:r>
+        <w:t xml:space="preserve">  1. "What is SNOMED concept 73211009?"</w:t>
+      </w:r>
+    </w:p>
+    <w:p>
+      <w:r>
+        <w:t xml:space="preserve">  2. "Look up concept 22298006"</w:t>
+      </w:r>
+    </w:p>
+    <w:p/>
+    <w:p>
+      <w:r>
+        <w:t xml:space="preserve">  Lexical Search</w:t>
+      </w:r>
+    </w:p>
+    <w:p/>
+    <w:p>
+      <w:r>
+        <w:t xml:space="preserve">  3. "Search SNOMED for concepts related to myocardial infarction"</w:t>
+      </w:r>
+    </w:p>
+    <w:p>
+      <w:r>
+        <w:t xml:space="preserve">  4. "Find SNOMED terms matching atrial fibrillation"</w:t>
+      </w:r>
+    </w:p>
+    <w:p>
+      <w:r>
+        <w:t xml:space="preserve">  5. "Search for concepts about type 2 diabetes"</w:t>
+      </w:r>
+    </w:p>
+    <w:p/>
+    <w:p>
+      <w:r>
+        <w:t xml:space="preserve">  Hierarchy Navigation</w:t>
+      </w:r>
+    </w:p>
+    <w:p/>
+    <w:p>
+      <w:r>
+        <w:t xml:space="preserve">  6. "What are the parent concepts of Type 2 diabetes mellitus (44054006)?"</w:t>
+      </w:r>
+    </w:p>
+    <w:p>
+      <w:r>
+        <w:t xml:space="preserve">  7. "Show me the children of Diabetes mellitus (73211009)"</w:t>
+      </w:r>
+    </w:p>
+    <w:p>
+      <w:r>
+        <w:t xml:space="preserve">  8. "What are all the ancestors of concept 44054006?"</w:t>
+      </w:r>
+    </w:p>
+    <w:p>
+      <w:r>
+        <w:t xml:space="preserve">  9. "Get the first 20 descendants of Clinical finding (404684003)"</w:t>
+      </w:r>
+    </w:p>
+    <w:p/>
+    <w:p>
+      <w:r>
+        <w:t xml:space="preserve">  Subsumption (IS-A)</w:t>
+      </w:r>
+    </w:p>
+    <w:p/>
+    <w:p>
+      <w:r>
+        <w:t xml:space="preserve">  10. "Is Type 2 diabetes mellitus (44054006) a subtype of Diabetes mellitus (73211009)?"</w:t>
+      </w:r>
+    </w:p>
+    <w:p>
+      <w:r>
+        <w:t xml:space="preserve">  11. "Is fracture of femur (71620000) a type of diabetes?"</w:t>
+      </w:r>
+    </w:p>
+    <w:p/>
+    <w:p>
+      <w:r>
+        <w:t xml:space="preserve">  Semantic Search (requires </w:t>
+      </w:r>
+      <w:proofErr w:type="spellStart"/>
+      <w:r>
+        <w:t>Ollama</w:t>
+      </w:r>
+      <w:proofErr w:type="spellEnd"/>
+      <w:r>
+        <w:t xml:space="preserve"> running)</w:t>
+      </w:r>
+    </w:p>
+    <w:p/>
+    <w:p>
+      <w:r>
+        <w:t xml:space="preserve">  12. "Find SNOMED concepts semantically similar to chest pain when breathing"</w:t>
+      </w:r>
+    </w:p>
+    <w:p>
+      <w:r>
+        <w:t xml:space="preserve">  13. "What concepts match the meaning of difficulty swallowing food?"</w:t>
+      </w:r>
+    </w:p>
+    <w:p>
+      <w:r>
+        <w:t xml:space="preserve">  14. "Find concepts related to rash appearing on both arms"</w:t>
+      </w:r>
+    </w:p>
+    <w:p/>
+    <w:p>
+      <w:r>
+        <w:t xml:space="preserve">  Multi-step Clinical Reasoning</w:t>
+      </w:r>
+    </w:p>
+    <w:p/>
+    <w:p>
+      <w:r>
+        <w:t xml:space="preserve">  15. "I have a patient with chest pain that worsens on inspiration. What SNOMED concepts might apply? Check if any are subtypes of Clinical finding."</w:t>
+      </w:r>
+    </w:p>
+    <w:p>
+      <w:r>
+        <w:t xml:space="preserve">  16. "Find all types of diabetes in SNOMED and tell me which ones are subtypes of Diabetes mellitus."</w:t>
+      </w:r>
+    </w:p>
+    <w:p>
+      <w:r>
+        <w:t xml:space="preserve">Is 73211009 a type of metabolic disease?                                                                                                                                  </w:t>
+      </w:r>
+    </w:p>
+    <w:p/>
+    <w:p>
+      <w:r>
+        <w:rPr>
+          <w:rFonts w:ascii="Apple Color Emoji" w:hAnsi="Apple Color Emoji" w:cs="Apple Color Emoji"/>
+        </w:rPr>
+        <w:t>⏺</w:t>
+      </w:r>
+      <w:r>
+        <w:t xml:space="preserve"> </w:t>
+      </w:r>
+      <w:proofErr w:type="spellStart"/>
+      <w:r>
+        <w:t>snomed</w:t>
+      </w:r>
+      <w:proofErr w:type="spellEnd"/>
+      <w:r>
+        <w:t xml:space="preserve"> - </w:t>
+      </w:r>
+      <w:proofErr w:type="spellStart"/>
+      <w:r>
+        <w:t>mcp_snomed_LexicalSearch</w:t>
+      </w:r>
+      <w:proofErr w:type="spellEnd"/>
+      <w:r>
+        <w:t xml:space="preserve"> (MCP)(term: "metabolic disease", </w:t>
+      </w:r>
+      <w:proofErr w:type="spellStart"/>
+      <w:r>
+        <w:t>maxResults</w:t>
+      </w:r>
+      <w:proofErr w:type="spellEnd"/>
+      <w:r>
+        <w:t>: 3)</w:t>
+      </w:r>
+    </w:p>
+    <w:p>
+      <w:r>
+        <w:t xml:space="preserve">  </w:t>
+      </w:r>
+      <w:r>
+        <w:rPr>
+          <w:rFonts w:ascii="Cambria Math" w:hAnsi="Cambria Math" w:cs="Cambria Math"/>
+        </w:rPr>
+        <w:t>⎿</w:t>
+      </w:r>
+      <w:r>
+        <w:t xml:space="preserve">  "[{\"</w:t>
+      </w:r>
+      <w:proofErr w:type="spellStart"/>
+      <w:r>
+        <w:t>ConceptId</w:t>
+      </w:r>
+      <w:proofErr w:type="spellEnd"/>
+      <w:r>
+        <w:t>\":\"75934005\",\"Term\":\"Metabolic disease\",\"TypeId\":\"900000000000013009\"},{\"ConceptId\":\"127339009\",\"Term\":\"Acute metabolic disease\",</w:t>
+      </w:r>
+    </w:p>
+    <w:p>
+      <w:r>
+        <w:t xml:space="preserve">     \"TypeId\":\"900000000000013009\"},{\"ConceptId\":\"737241008\",\"Term\":\"Autonomic neuropathy due to metabolic disease\",\"</w:t>
+      </w:r>
+      <w:proofErr w:type="spellStart"/>
+      <w:r>
+        <w:t>TypeId</w:t>
+      </w:r>
+      <w:proofErr w:type="spellEnd"/>
+      <w:r>
+        <w:t>\":\"900000000000013009\"}]"</w:t>
+      </w:r>
+    </w:p>
+    <w:p/>
+    <w:p>
+      <w:r>
+        <w:rPr>
+          <w:rFonts w:ascii="Apple Color Emoji" w:hAnsi="Apple Color Emoji" w:cs="Apple Color Emoji"/>
+        </w:rPr>
+        <w:t>⏺</w:t>
+      </w:r>
+      <w:r>
+        <w:t xml:space="preserve"> </w:t>
+      </w:r>
+      <w:proofErr w:type="spellStart"/>
+      <w:r>
+        <w:t>snomed</w:t>
+      </w:r>
+      <w:proofErr w:type="spellEnd"/>
+      <w:r>
+        <w:t xml:space="preserve"> - </w:t>
+      </w:r>
+      <w:proofErr w:type="spellStart"/>
+      <w:r>
+        <w:t>mcp_snomed_IsA</w:t>
+      </w:r>
+      <w:proofErr w:type="spellEnd"/>
+      <w:r>
+        <w:t xml:space="preserve"> (MCP)(</w:t>
+      </w:r>
+      <w:proofErr w:type="spellStart"/>
+      <w:r>
+        <w:t>conceptId</w:t>
+      </w:r>
+      <w:proofErr w:type="spellEnd"/>
+      <w:r>
+        <w:t xml:space="preserve">: "73211009", </w:t>
+      </w:r>
+      <w:proofErr w:type="spellStart"/>
+      <w:r>
+        <w:t>ancestorId</w:t>
+      </w:r>
+      <w:proofErr w:type="spellEnd"/>
+      <w:r>
+        <w:t>: "75934005")</w:t>
+      </w:r>
+    </w:p>
+    <w:p>
+      <w:r>
+        <w:t xml:space="preserve">  </w:t>
+      </w:r>
+      <w:r>
+        <w:rPr>
+          <w:rFonts w:ascii="Cambria Math" w:hAnsi="Cambria Math" w:cs="Cambria Math"/>
+        </w:rPr>
+        <w:t>⎿</w:t>
+      </w:r>
+      <w:r>
+        <w:t xml:space="preserve">  "{\"isDescendant\":1,\"conceptId\":\"73211009\",\"ancestorId\":\"75934005\"}"</w:t>
+      </w:r>
+    </w:p>
+    <w:p/>
+    <w:p>
+      <w:r>
+        <w:rPr>
+          <w:rFonts w:ascii="Apple Color Emoji" w:hAnsi="Apple Color Emoji" w:cs="Apple Color Emoji"/>
+        </w:rPr>
+        <w:t>⏺</w:t>
+      </w:r>
+      <w:r>
+        <w:t xml:space="preserve"> Yes — Diabetes mellitus (73211009) is a type of Metabolic disease (75934005) in the SNOMED CT hierarchy. The </w:t>
+      </w:r>
+      <w:proofErr w:type="spellStart"/>
+      <w:r>
+        <w:t>is</w:t>
+      </w:r>
+      <w:proofErr w:type="spellEnd"/>
+      <w:r>
+        <w:t>-a (subsumption) relationship is confirmed.</w:t>
+      </w:r>
+    </w:p>
+    <w:p>
+      <w:r>
+        <w:t xml:space="preserve">  ---</w:t>
+      </w:r>
+    </w:p>
+    <w:p>
+      <w:r>
+        <w:t xml:space="preserve">  Note on semantic search: The </w:t>
+      </w:r>
+      <w:proofErr w:type="spellStart"/>
+      <w:r>
+        <w:t>Ollama</w:t>
+      </w:r>
+      <w:proofErr w:type="spellEnd"/>
+      <w:r>
+        <w:t xml:space="preserve"> container needs to be reachable from inside the IRIS container. Since they're standalone containers (not on a shared network),</w:t>
+      </w:r>
+    </w:p>
+    <w:p>
+      <w:r>
+        <w:t xml:space="preserve">  semantic search may fail. If it does, we can link them with a Docker network. Lexical search and hierarchy queries will work immediately regardless.</w:t>
+      </w:r>
+    </w:p>
+    <w:p/>
+    <w:p>
+      <w:r>
+        <w:t>Now let me tell you to reconnect to the MCP server so we can test it live. Use /</w:t>
+      </w:r>
+      <w:proofErr w:type="spellStart"/>
+      <w:r>
+        <w:t>mcp</w:t>
+      </w:r>
+      <w:proofErr w:type="spellEnd"/>
+      <w:r>
+        <w:t xml:space="preserve"> to reconnect, and the tools should now be available.</w:t>
+      </w:r>
+    </w:p>
+    <w:p/>
+    <w:p>
+      <w:r>
+        <w:lastRenderedPageBreak/>
+        <w:t xml:space="preserve">  Summary</w:t>
+      </w:r>
+    </w:p>
+    <w:p/>
+    <w:p>
+      <w:r>
+        <w:t xml:space="preserve">  The SNOMED MCP server had two security issues preventing tool discovery and execution:</w:t>
+      </w:r>
+    </w:p>
+    <w:p/>
+    <w:p>
+      <w:r>
+        <w:t xml:space="preserve">  Problem 1: HTTP 403 on tool discovery</w:t>
+      </w:r>
+    </w:p>
+    <w:p/>
+    <w:p>
+      <w:r>
+        <w:t xml:space="preserve">  The %</w:t>
+      </w:r>
+      <w:proofErr w:type="spellStart"/>
+      <w:r>
+        <w:t>AI.MCP.Service.AccessCheck</w:t>
+      </w:r>
+      <w:proofErr w:type="spellEnd"/>
+      <w:r>
+        <w:t xml:space="preserve"> method checks if the effective user has READ access to the %DB_USER database resource. The web app used unauthenticated access</w:t>
+      </w:r>
+    </w:p>
+    <w:p>
+      <w:r>
+        <w:t xml:space="preserve">  (</w:t>
+      </w:r>
+      <w:proofErr w:type="spellStart"/>
+      <w:r>
+        <w:t>AutheEnabled</w:t>
+      </w:r>
+      <w:proofErr w:type="spellEnd"/>
+      <w:r>
+        <w:t xml:space="preserve">=64), meaning requests ran as </w:t>
+      </w:r>
+      <w:proofErr w:type="spellStart"/>
+      <w:r>
+        <w:t>UnknownUser</w:t>
+      </w:r>
+      <w:proofErr w:type="spellEnd"/>
+      <w:r>
+        <w:t xml:space="preserve"> — which had no roles.</w:t>
+      </w:r>
+    </w:p>
+    <w:p/>
+    <w:p>
+      <w:r>
+        <w:t xml:space="preserve">  Fix: Grant %DB_USER role to </w:t>
+      </w:r>
+      <w:proofErr w:type="spellStart"/>
+      <w:r>
+        <w:t>UnknownUser</w:t>
+      </w:r>
+      <w:proofErr w:type="spellEnd"/>
+      <w:r>
+        <w:t xml:space="preserve"> and </w:t>
+      </w:r>
+      <w:proofErr w:type="spellStart"/>
+      <w:r>
+        <w:t>CSPSystem</w:t>
+      </w:r>
+      <w:proofErr w:type="spellEnd"/>
+      <w:r>
+        <w:t>.</w:t>
+      </w:r>
+    </w:p>
+    <w:p/>
+    <w:p>
+      <w:r>
+        <w:t xml:space="preserve">  Problem 2: SQL "Prepare failed" on tool execution</w:t>
+      </w:r>
+    </w:p>
+    <w:p/>
+    <w:p>
+      <w:r>
+        <w:t xml:space="preserve">  Even after discovery worked, the tools returned "Prepare failed" because the MCP execution context (via </w:t>
+      </w:r>
+      <w:proofErr w:type="spellStart"/>
+      <w:r>
+        <w:t>CSPSystem</w:t>
+      </w:r>
+      <w:proofErr w:type="spellEnd"/>
+      <w:r>
+        <w:t xml:space="preserve"> SuperServer connection) lacked SQL SELECT privileges on</w:t>
+      </w:r>
+    </w:p>
+    <w:p>
+      <w:r>
+        <w:t xml:space="preserve">  the SNOMED tables.</w:t>
+      </w:r>
+    </w:p>
+    <w:p/>
+    <w:p>
+      <w:r>
+        <w:t xml:space="preserve">  Fix: GRANT SELECT ON SCHEMA SNOMED TO _PUBLIC</w:t>
+      </w:r>
+    </w:p>
+    <w:p/>
+    <w:p>
+      <w:r>
+        <w:t xml:space="preserve">  Changes made:</w:t>
+      </w:r>
+    </w:p>
+    <w:p/>
+    <w:p>
+      <w:r>
+        <w:t xml:space="preserve">  1. src/SNOMED/</w:t>
+      </w:r>
+      <w:proofErr w:type="spellStart"/>
+      <w:r>
+        <w:t>Installer.cls</w:t>
+      </w:r>
+      <w:proofErr w:type="spellEnd"/>
+      <w:r>
+        <w:t xml:space="preserve"> — Added </w:t>
+      </w:r>
+      <w:proofErr w:type="spellStart"/>
+      <w:r>
+        <w:t>GrantSQLAccess</w:t>
+      </w:r>
+      <w:proofErr w:type="spellEnd"/>
+      <w:r>
+        <w:t xml:space="preserve">() method (GRANT SELECT to _PUBLIC) and </w:t>
+      </w:r>
+      <w:proofErr w:type="spellStart"/>
+      <w:r>
+        <w:t>GrantRoleToUser</w:t>
+      </w:r>
+      <w:proofErr w:type="spellEnd"/>
+      <w:r>
+        <w:t xml:space="preserve">() helper to grant %DB_USER to both </w:t>
+      </w:r>
+      <w:proofErr w:type="spellStart"/>
+      <w:r>
+        <w:t>UnknownUser</w:t>
+      </w:r>
+      <w:proofErr w:type="spellEnd"/>
+      <w:r>
+        <w:t xml:space="preserve"> and </w:t>
+      </w:r>
+      <w:proofErr w:type="spellStart"/>
+      <w:r>
+        <w:t>CSPSystem</w:t>
+      </w:r>
+      <w:proofErr w:type="spellEnd"/>
+    </w:p>
+    <w:p>
+      <w:r>
+        <w:t xml:space="preserve">  during setup.</w:t>
+      </w:r>
+    </w:p>
+    <w:p>
+      <w:r>
+        <w:lastRenderedPageBreak/>
+        <w:t xml:space="preserve">  2. Live container fix — Applied both fixes to the running container so the MCP server works now.</w:t>
+      </w:r>
+    </w:p>
+    <w:p/>
+    <w:p>
+      <w:r>
+        <w:t xml:space="preserve">  Please run /</w:t>
+      </w:r>
+      <w:proofErr w:type="spellStart"/>
+      <w:r>
+        <w:t>mcp</w:t>
+      </w:r>
+      <w:proofErr w:type="spellEnd"/>
+      <w:r>
+        <w:t xml:space="preserve"> to reconnect and the 9 SNOMED tools should be available.</w:t>
       </w:r>
     </w:p>
     <w:sectPr>
@@ -582,7 +2333,6 @@
     <w:next w:val="Normal"/>
     <w:link w:val="Heading2Char"/>
     <w:uiPriority w:val="9"/>
-    <w:semiHidden/>
     <w:unhideWhenUsed/>
     <w:qFormat/>
     <w:rsid w:val="007F4B4B"/>
@@ -799,7 +2549,6 @@
     <w:basedOn w:val="DefaultParagraphFont"/>
     <w:link w:val="Heading2"/>
     <w:uiPriority w:val="9"/>
-    <w:semiHidden/>
     <w:rsid w:val="007F4B4B"/>
     <w:rPr>
       <w:rFonts w:asciiTheme="majorHAnsi" w:eastAsiaTheme="majorEastAsia" w:hAnsiTheme="majorHAnsi" w:cstheme="majorBidi"/>

</xml_diff>